<commit_message>
[NovelOS-Fix] Khac phuc triet de loi Continuity Regression: Chuc danh Giam doc Ky thuat Du lieu cua Minh An (CANON-005, Ch 43 & Ch 45)
</commit_message>
<xml_diff>
--- a/manuscript/word/volume_01/arc_01/ch_045.docx
+++ b/manuscript/word/volume_01/arc_01/ch_045.docx
@@ -165,7 +165,7 @@
           <w:color w:val="141414"/>
           <w:sz w:val="24"/>
         </w:rPr>
-        <w:t>word_count: 2715</w:t>
+        <w:t>word_count: 4140</w:t>
       </w:r>
     </w:p>
     <w:p>
@@ -810,7 +810,7 @@
           <w:color w:val="141414"/>
           <w:sz w:val="24"/>
         </w:rPr>
-        <w:t>Một tin nhắn Zalo từ anh Trưởng phòng tiếp thị gửi lúc bốn giờ chiều: *"An ơi, file kế hoạch chạy chiến dịch quý bốn cho nhãn hàng gia dụng em chỉnh sửa bảng tính dự toán ngân sách xong chưa? Sáng mai gửi anh sớm trước chín giờ để họp ban giám đốc nhé."*</w:t>
+        <w:t>Một tin nhắn từ kỹ sư Tuấn — phó phòng vận hành máy chủ của Viện Nghiên cứu Địa tầng và Năng lượng Nội sinh Đô thị — gửi qua cổng điều hành nội bộ lúc bốn giờ chiều: *"Anh An ơi, toàn bộ dữ liệu đo đạc thủy đạc và phổ rung chấn tầng sâu tại tọa độ ngã ba sông Nhà Bè chiều nay đã được nhóm kỹ thuật nạp vào mô hình phân tích rồi. Em đã gửi bảng đối soát và đồ thị áp suất qua email bảo mật, anh xem qua rồi ký duyệt điện tử giúp tụi em để sáng mai kịp nộp hồ sơ tổng hợp lên Viện trưởng Nam nhé."*</w:t>
       </w:r>
     </w:p>
     <w:p>
@@ -825,7 +825,7 @@
           <w:color w:val="141414"/>
           <w:sz w:val="24"/>
         </w:rPr>
-        <w:t>Tôi kéo ghế ngồi vào bàn, mở chiếc máy tính xách tay cũ lên. Những con số biểu phí, phân bổ ngân sách quảng cáo và bảng tiến độ công việc hiện ra trên màn hình. Tôi gõ bàn phím thoăn thoắt, hoàn thiện nốt hai bảng tính còn dở dang rồi đính kèm file gửi qua email công ty kèm lời nhắn: *"Em đã cập nhật số liệu chi tiết theo yêu cầu của anh. Chúc anh buổi tối vui vẻ."*</w:t>
+        <w:t>Tôi kéo ghế ngồi vào bàn, mở chiếc máy tính xách tay lên. Những dòng dữ liệu ma trận đệ quy, biểu đồ dòng chảy tầng đáy và các thông số suy giảm áp suất thủy tĩnh sau khi then xả áp Ngạc Khảm được mở hiện ra rõ ràng trên màn hình chuyên dụng. Với vai trò Giám đốc Kỹ thuật Dữ liệu, tôi chăm chú đối soát từng tham số thuật toán, kiểm tra lại biên độ dao động sóng của khối đá Huyết Ngọc rồi dùng khóa chữ ký số nội bộ phê duyệt toàn bộ tập dữ liệu. Xong xuôi, tôi gõ vài dòng phản hồi: *"Dữ liệu rất chuẩn xác, mô hình chạy ổn định. Em in bộ hồ sơ này ra, chín giờ sáng mai anh sẽ có mặt ở Viện để họp giao ban cùng Viện trưởng Nam."*</w:t>
       </w:r>
     </w:p>
     <w:p>
@@ -840,7 +840,7 @@
           <w:color w:val="141414"/>
           <w:sz w:val="24"/>
         </w:rPr>
-        <w:t>Vừa gửi xong email thì màn hình điện thoại lại rung lên. Lần này là cuộc gọi video từ mẹ ở quê.</w:t>
+        <w:t>Vừa gửi xong phản hồi thì màn hình điện thoại lại rung lên. Lần này là cuộc gọi video từ mẹ ở quê.</w:t>
       </w:r>
     </w:p>
     <w:p>
@@ -915,7 +915,7 @@
           <w:color w:val="141414"/>
           <w:sz w:val="24"/>
         </w:rPr>
-        <w:t>"Bố mày vừa ra trông vườn về, dạo này lưng ông ấy đỡ đau rồi nhờ có thuốc con gửi về đợt trước đấy. Mẹ nghe đài báo mấy bữa nay trong miền Nam mưa gió thất thường dữ lắm, con đi làm nhớ mang theo áo mưa nghe chưa, đừng có cậy khỏe mà tắm mưa rồi cảm lạnh. Tiền nhà tháng này có thiếu thốn gì không, bố mẹ vừa bán lứa lợn, nếu kẹt thì bảo bố chuyển cho một ít mà trang trải nghe con..."</w:t>
+        <w:t>"Bố mày vừa ra trông vườn về, dạo này lưng ông ấy đỡ đau rồi nhờ có thuốc con gửi về đợt trước đấy. Mẹ nghe đài báo mấy bữa nay trong miền Nam mưa gió thất thường dữ lắm, con đi làm nhớ mang theo áo mưa nghe chưa, đừng có cậy khỏe mà tắm mưa rồi cảm lạnh. Dạo này công việc ở Viện nghiên cứu có áp lực lắm không con? Bố mày cứ khoe khắp xóm là con trai làm giám đốc kỹ thuật ngoài thành phố, nhưng mẹ chỉ lo con thức đêm thức hôm gầy rộc người đi. Ăn uống nhớ bồi dưỡng nghe con, đừng có tiếc tiền..."</w:t>
       </w:r>
     </w:p>
     <w:p>
@@ -945,7 +945,7 @@
           <w:color w:val="141414"/>
           <w:sz w:val="24"/>
         </w:rPr>
-        <w:t>Đó chính là cội nguồn của tôi. Tôi không phải là một bậc siêu nhân thần thánh mang sứ mệnh gánh vác cõi trời đất nào cả; tôi chỉ là đứa con trai của mẹ, một đứa con sinh ra từ bùn đất quê hương, đang từng ngày nỗ lực bươn chải nơi đô thị để sống tự lập và chăm lo cho gia đình.</w:t>
+        <w:t>Đó chính là cội nguồn của tôi. Dù có mang danh Giám đốc Kỹ thuật Dữ liệu hay nắm giữ sức mạnh Thể Đạo phi phàm, tôi vẫn mãi là đứa con trai của mẹ, một đứa con sinh ra từ bùn đất quê hương, luôn khắc ghi bổn phận phụng dưỡng gia đình.</w:t>
       </w:r>
     </w:p>
     <w:p>
@@ -960,7 +960,7 @@
           <w:color w:val="141414"/>
           <w:sz w:val="24"/>
         </w:rPr>
-        <w:t>"Con không thiếu tiền đâu mẹ, tháng này con được thưởng dự án nữa, mai con gửi về cho mẹ mua sữa bồi bổ cho bố nhé. Mẹ ngủ sớm đi nha."</w:t>
+        <w:t>"Con không sao đâu mẹ, công việc ở Viện tuy nhiều việc nhưng con sắp xếp khoa học lắm, tháng này tiền lương và phụ cấp chuyên gia của con cao hơn trước nhiều, mai con chuyển khoản về cho mẹ gửi tiết kiệm và mua thêm thuốc bổ cho bố nhé. Mẹ ngủ sớm đi nha."</w:t>
       </w:r>
     </w:p>
     <w:p>
@@ -975,7 +975,7 @@
           <w:color w:val="141414"/>
           <w:sz w:val="24"/>
         </w:rPr>
-        <w:t>"Ừ, con cũng ngủ sớm đi nghe, đừng có thức khuya ôm cái máy tính hại mắt..."</w:t>
+        <w:t>"Ừ, con cũng ngủ sớm đi nghe, đừng có thức khuya quá hại người..."</w:t>
       </w:r>
     </w:p>
     <w:p>
@@ -1425,7 +1425,7 @@
           <w:color w:val="141414"/>
           <w:sz w:val="24"/>
         </w:rPr>
-        <w:t>*Thứ nhất, Thể Đạo phàm nhân lấy thân xác làm lò luyện, lấy cơm áo gạo tiền và lao động trần thế làm củi lửa. Đừng bao giờ xa rời cuộc sống hiện thực. Hãy làm việc chăm chỉ, ăn uống đủ chất dinh dưỡng, hiếu kính cha mẹ và giữ trọn bổn phận của một con người bình thường giữa xã hội.*</w:t>
+        <w:t>*Thứ nhất, Thể Đạo phàm nhân lấy thân xác làm lò luyện, lấy lao động trần thế và tinh thần trách nhiệm làm củi lửa. Đừng bao giờ xa rời cuộc sống hiện thực. Hãy cống hiến trí tuệ cho đời, ăn uống đủ chất dinh dưỡng, hiếu kính cha mẹ và giữ trọn bổn phận của một con người chính trực giữa xã hội.*</w:t>
       </w:r>
     </w:p>
     <w:p>

</xml_diff>

<commit_message>
fix(canon): sua triet de 7 diem san cot truyen, dia ly, lich su cong nghe va danh xung tu ch1 den ch70
</commit_message>
<xml_diff>
--- a/manuscript/word/volume_01/arc_01/ch_045.docx
+++ b/manuscript/word/volume_01/arc_01/ch_045.docx
@@ -15,7 +15,7 @@
         </w:rPr>
         <w:t>PHÁ TRỜI</w:t>
         <w:br/>
-        <w:t>CHƯƠNG 45: LÂM TỊCH TRẦM MIÊN VÀ NGƯỜI GÁC CỔNG CÔ ĐỘC</w:t>
+        <w:t>CHƯƠNG 45</w:t>
       </w:r>
     </w:p>
     <w:p>
@@ -165,7 +165,7 @@
           <w:color w:val="141414"/>
           <w:sz w:val="24"/>
         </w:rPr>
-        <w:t>word_count: 3120</w:t>
+        <w:t>word_count: 3292</w:t>
       </w:r>
     </w:p>
     <w:p>
@@ -630,7 +630,7 @@
           <w:color w:val="141414"/>
           <w:sz w:val="24"/>
         </w:rPr>
-        <w:t>*"Báo cáo Giám đốc Minh An, toàn bộ các trạm quan trắc địa kỹ thuật tại Ba Son, Thủ Thiêm và Nhà Bè đã được thiết lập chế độ cô lập dữ liệu theo lệnh của Hội đồng Khoa học. Em đã chuyển đổi toàn bộ thuật toán phân tích về trạng thái thụ động. Kính gửi anh duyệt biên bản đóng hồ sơ sự cố."*</w:t>
+        <w:t>*"Báo cáo Giám đốc Minh An, toàn bộ các trạm quan trắc địa kỹ thuật tại Ba Son, Thủ Thiêm và Nhà Bè đã được thiết lập chế độ cô lập dữ liệu theo lệnh của Hội đồng Khoa học. Nhóm kỹ thuật đã chuyển đổi toàn bộ thuật toán phân tích về trạng thái thụ động. Kính gửi Giám đốc duyệt biên bản đóng hồ sơ sự cố. — Kỹ sư Tuấn."*</w:t>
       </w:r>
     </w:p>
     <w:p>

</xml_diff>